<commit_message>
Update agronomy module documentation
Co-authored-by: Leonardom97 <100780990+Leonardom97@users.noreply.github.com>
</commit_message>
<xml_diff>
--- a/OSM_Documentacion.docx
+++ b/OSM_Documentacion.docx
@@ -405,649 +405,6 @@
       </w:r>
     </w:p>
     <w:p/>
-    <w:p>
-      <w:pPr>
-        <w:rPr>
-          <w:b/>
-          <w:bCs/>
-        </w:rPr>
-      </w:pPr>
-      <w:r>
-        <w:rPr>
-          <w:b/>
-          <w:bCs/>
-        </w:rPr>
-        <w:t>5. Módulo Agronómico</w:t>
-      </w:r>
-    </w:p>
-    <w:p>
-      <w:r>
-        <w:t xml:space="preserve">   - </w:t>
-      </w:r>
-      <w:r>
-        <w:t xml:space="preserve">Formulario de tablas de las bases de datos </w:t>
-      </w:r>
-    </w:p>
-    <w:p>
-      <w:r>
-        <w:t xml:space="preserve">   - Fecha corte </w:t>
-      </w:r>
-    </w:p>
-    <w:p>
-      <w:r>
-        <w:t xml:space="preserve">  </w:t>
-      </w:r>
-      <w:r>
-        <w:t>-</w:t>
-      </w:r>
-      <w:r>
-        <w:t xml:space="preserve"> Gestión permisos </w:t>
-      </w:r>
-    </w:p>
-    <w:p>
-      <w:pPr>
-        <w:rPr>
-          <w:u w:val="single"/>
-        </w:rPr>
-      </w:pPr>
-    </w:p>
-    <w:p>
-      <w:pPr>
-        <w:rPr>
-          <w:b/>
-          <w:bCs/>
-        </w:rPr>
-      </w:pPr>
-      <w:r>
-        <w:rPr>
-          <w:b/>
-          <w:bCs/>
-        </w:rPr>
-        <w:t>6.</w:t>
-      </w:r>
-      <w:r>
-        <w:rPr>
-          <w:b/>
-          <w:bCs/>
-        </w:rPr>
-        <w:t xml:space="preserve"> </w:t>
-      </w:r>
-      <w:r>
-        <w:rPr>
-          <w:b/>
-          <w:bCs/>
-        </w:rPr>
-        <w:t>Sistema de Pesaje</w:t>
-      </w:r>
-    </w:p>
-    <w:p>
-      <w:r>
-        <w:t xml:space="preserve">   - Registro de pesaje de materia prima</w:t>
-      </w:r>
-    </w:p>
-    <w:p>
-      <w:r>
-        <w:t xml:space="preserve">   - Control de entrada de fruta fresca</w:t>
-      </w:r>
-    </w:p>
-    <w:p>
-      <w:r>
-        <w:t xml:space="preserve">   - Integración con báscula</w:t>
-      </w:r>
-    </w:p>
-    <w:p/>
-    <w:p>
-      <w:pPr>
-        <w:rPr>
-          <w:b/>
-          <w:bCs/>
-        </w:rPr>
-      </w:pPr>
-      <w:r>
-        <w:rPr>
-          <w:b/>
-          <w:bCs/>
-        </w:rPr>
-        <w:t>7. Modulo laboratorio</w:t>
-      </w:r>
-    </w:p>
-    <w:p>
-      <w:pPr>
-        <w:rPr>
-          <w:lang w:val="es-CO"/>
-        </w:rPr>
-      </w:pPr>
-      <w:r>
-        <w:t xml:space="preserve">  - Sistema de </w:t>
-      </w:r>
-      <w:r>
-        <w:rPr>
-          <w:lang w:val="es-CO"/>
-        </w:rPr>
-        <w:t>Formulario de Calidad</w:t>
-      </w:r>
-    </w:p>
-    <w:p>
-      <w:r>
-        <w:rPr>
-          <w:lang w:val="es-CO"/>
-        </w:rPr>
-        <w:t xml:space="preserve">  </w:t>
-      </w:r>
-      <w:r>
-        <w:t>- Sistema de</w:t>
-      </w:r>
-      <w:r>
-        <w:t xml:space="preserve"> </w:t>
-      </w:r>
-      <w:r>
-        <w:t>inventario diario de tanques. </w:t>
-      </w:r>
-    </w:p>
-    <w:p>
-      <w:pPr>
-        <w:rPr>
-          <w:lang w:val="es-CO"/>
-        </w:rPr>
-      </w:pPr>
-    </w:p>
-    <w:p>
-      <w:pPr>
-        <w:rPr>
-          <w:b/>
-          <w:bCs/>
-          <w:lang w:val="es-CO"/>
-        </w:rPr>
-      </w:pPr>
-      <w:r>
-        <w:rPr>
-          <w:b/>
-          <w:bCs/>
-          <w:lang w:val="es-CO"/>
-        </w:rPr>
-        <w:t xml:space="preserve">8. Módulo de logística </w:t>
-      </w:r>
-    </w:p>
-    <w:p>
-      <w:r>
-        <w:t xml:space="preserve">   </w:t>
-      </w:r>
-      <w:r>
-        <w:t>- Sistema de</w:t>
-      </w:r>
-      <w:r>
-        <w:t xml:space="preserve"> programación de vehículos </w:t>
-      </w:r>
-    </w:p>
-    <w:p>
-      <w:r>
-        <w:t xml:space="preserve">   </w:t>
-      </w:r>
-      <w:r>
-        <w:t>- Sistema de</w:t>
-      </w:r>
-      <w:r>
-        <w:t xml:space="preserve"> remisión de despachos </w:t>
-      </w:r>
-    </w:p>
-    <w:p/>
-    <w:p>
-      <w:r>
-        <w:rPr>
-          <w:b/>
-          <w:bCs/>
-        </w:rPr>
-        <w:t xml:space="preserve">9. Modulo portería </w:t>
-      </w:r>
-    </w:p>
-    <w:p>
-      <w:pPr>
-        <w:rPr>
-          <w:lang w:val="es-CO"/>
-        </w:rPr>
-      </w:pPr>
-      <w:r>
-        <w:t>- Sistema de</w:t>
-      </w:r>
-      <w:r>
-        <w:t xml:space="preserve"> </w:t>
-      </w:r>
-      <w:r>
-        <w:rPr>
-          <w:lang w:val="es-CO"/>
-        </w:rPr>
-        <w:t>Inventario Portería</w:t>
-      </w:r>
-    </w:p>
-    <w:p>
-      <w:pPr>
-        <w:rPr>
-          <w:u w:val="single"/>
-        </w:rPr>
-      </w:pPr>
-      <w:r>
-        <w:t xml:space="preserve">- Sistema de </w:t>
-      </w:r>
-      <w:r>
-        <w:t xml:space="preserve">control de acceso </w:t>
-      </w:r>
-    </w:p>
-    <w:p/>
-    <w:p>
-      <w:pPr>
-        <w:rPr>
-          <w:u w:val="single"/>
-        </w:rPr>
-      </w:pPr>
-      <w:r>
-        <w:lastRenderedPageBreak/>
-        <w:t>---------------------------------------------------------------------------------</w:t>
-      </w:r>
-    </w:p>
-    <w:p>
-      <w:pPr>
-        <w:pStyle w:val="Prrafodelista"/>
-        <w:numPr>
-          <w:ilvl w:val="0"/>
-          <w:numId w:val="11"/>
-        </w:numPr>
-        <w:rPr>
-          <w:b/>
-          <w:bCs/>
-        </w:rPr>
-      </w:pPr>
-      <w:r>
-        <w:rPr>
-          <w:b/>
-          <w:bCs/>
-        </w:rPr>
-        <w:t>CONTEXTO DEL PROYECTO</w:t>
-      </w:r>
-    </w:p>
-    <w:p>
-      <w:r>
-        <w:t>El sistema OSM fue desarrollado para resolver las necesidades operacionales de una empresa agroindustrial dedicada a la producción de aceite de palma africana. Antes de la implementación de OSM, la empresa enfrentaba varios desafíos:</w:t>
-      </w:r>
-    </w:p>
-    <w:p/>
-    <w:p>
-      <w:r>
-        <w:rPr>
-          <w:b/>
-          <w:bCs/>
-        </w:rPr>
-        <w:t>1. Dispersión de Información:</w:t>
-      </w:r>
-      <w:r>
-        <w:t xml:space="preserve"> Datos operacionales distribuidos en múltiples sistemas incompatibles</w:t>
-      </w:r>
-    </w:p>
-    <w:p>
-      <w:r>
-        <w:rPr>
-          <w:b/>
-          <w:bCs/>
-        </w:rPr>
-        <w:t>2. Gestión Manual:</w:t>
-      </w:r>
-      <w:r>
-        <w:t xml:space="preserve"> Procesos críticos realizados de forma manual o en hojas de cálculo</w:t>
-      </w:r>
-    </w:p>
-    <w:p>
-      <w:r>
-        <w:rPr>
-          <w:b/>
-          <w:bCs/>
-        </w:rPr>
-        <w:t>3. Falta de Trazabilidad:</w:t>
-      </w:r>
-      <w:r>
-        <w:t xml:space="preserve"> Dificultad para rastrear el progreso de capacitaciones y cumplimiento normativo</w:t>
-      </w:r>
-    </w:p>
-    <w:p>
-      <w:r>
-        <w:rPr>
-          <w:b/>
-          <w:bCs/>
-        </w:rPr>
-        <w:t>4. Ineficiencia en Comunicación:</w:t>
-      </w:r>
-      <w:r>
-        <w:t xml:space="preserve"> Carencia de un sistema centralizado de notificaciones</w:t>
-      </w:r>
-    </w:p>
-    <w:p>
-      <w:r>
-        <w:rPr>
-          <w:b/>
-          <w:bCs/>
-        </w:rPr>
-        <w:t>5. Desintegración de Módulos:</w:t>
-      </w:r>
-      <w:r>
-        <w:t xml:space="preserve"> Operaciones agrícolas, administrativas e industriales operando de forma aislada</w:t>
-      </w:r>
-    </w:p>
-    <w:p/>
-    <w:p>
-      <w:pPr>
-        <w:pStyle w:val="Prrafodelista"/>
-        <w:numPr>
-          <w:ilvl w:val="0"/>
-          <w:numId w:val="11"/>
-        </w:numPr>
-        <w:rPr>
-          <w:b/>
-          <w:bCs/>
-        </w:rPr>
-      </w:pPr>
-      <w:r>
-        <w:rPr>
-          <w:b/>
-          <w:bCs/>
-        </w:rPr>
-        <w:t>PROPÓSITO DEL SISTEMA</w:t>
-      </w:r>
-    </w:p>
-    <w:p>
-      <w:r>
-        <w:rPr>
-          <w:b/>
-          <w:bCs/>
-        </w:rPr>
-        <w:t>Objetivo Principal:</w:t>
-      </w:r>
-      <w:r>
-        <w:t xml:space="preserve"> </w:t>
-      </w:r>
-    </w:p>
-    <w:p>
-      <w:r>
-        <w:t>Centralizar y automatizar la gestión operacional completa de la empresa, desde la administración de recursos humanos hasta el control de procesos agrícolas e industriales.</w:t>
-      </w:r>
-    </w:p>
-    <w:p>
-      <w:pPr>
-        <w:rPr>
-          <w:b/>
-          <w:bCs/>
-        </w:rPr>
-      </w:pPr>
-      <w:r>
-        <w:rPr>
-          <w:b/>
-          <w:bCs/>
-        </w:rPr>
-        <w:t>Objetivos Específicos</w:t>
-      </w:r>
-      <w:r>
-        <w:rPr>
-          <w:b/>
-          <w:bCs/>
-        </w:rPr>
-        <w:t>:</w:t>
-      </w:r>
-    </w:p>
-    <w:p>
-      <w:pPr>
-        <w:rPr>
-          <w:b/>
-          <w:bCs/>
-        </w:rPr>
-      </w:pPr>
-      <w:r>
-        <w:rPr>
-          <w:b/>
-          <w:bCs/>
-        </w:rPr>
-        <w:t>1. Cumplimiento Normativo</w:t>
-      </w:r>
-    </w:p>
-    <w:p>
-      <w:r>
-        <w:t xml:space="preserve">   - Garantizar el cumplimiento de certificaciones (RSPO, ISCC, Orgánico)</w:t>
-      </w:r>
-    </w:p>
-    <w:p>
-      <w:r>
-        <w:t xml:space="preserve">   - Mantener registros actualizados de capacitaciones obligatorias</w:t>
-      </w:r>
-    </w:p>
-    <w:p>
-      <w:r>
-        <w:t xml:space="preserve">   - Documentar trazabilidad de procesos</w:t>
-      </w:r>
-    </w:p>
-    <w:p/>
-    <w:p>
-      <w:pPr>
-        <w:rPr>
-          <w:b/>
-          <w:bCs/>
-        </w:rPr>
-      </w:pPr>
-      <w:r>
-        <w:rPr>
-          <w:b/>
-          <w:bCs/>
-        </w:rPr>
-        <w:t>2. Eficiencia Operacional</w:t>
-      </w:r>
-    </w:p>
-    <w:p>
-      <w:r>
-        <w:t xml:space="preserve">   - Reducir tiempo de gestión administrativa</w:t>
-      </w:r>
-    </w:p>
-    <w:p>
-      <w:r>
-        <w:t xml:space="preserve">   - Automatizar notificaciones y alertas</w:t>
-      </w:r>
-    </w:p>
-    <w:p>
-      <w:r>
-        <w:lastRenderedPageBreak/>
-        <w:t xml:space="preserve">   - Centralizar información crítica del negocio</w:t>
-      </w:r>
-    </w:p>
-    <w:p>
-      <w:r>
-        <w:t xml:space="preserve">   - Facilitar toma de decisiones basada en datos</w:t>
-      </w:r>
-    </w:p>
-    <w:p>
-      <w:pPr>
-        <w:rPr>
-          <w:b/>
-          <w:bCs/>
-        </w:rPr>
-      </w:pPr>
-      <w:r>
-        <w:rPr>
-          <w:b/>
-          <w:bCs/>
-        </w:rPr>
-        <w:t>3. Gestión del Talento</w:t>
-      </w:r>
-    </w:p>
-    <w:p>
-      <w:r>
-        <w:t xml:space="preserve">   - Control integral de colaboradores</w:t>
-      </w:r>
-    </w:p>
-    <w:p>
-      <w:r>
-        <w:t xml:space="preserve">   - Seguimiento de capacitaciones y desarrollo profesional</w:t>
-      </w:r>
-    </w:p>
-    <w:p>
-      <w:r>
-        <w:t xml:space="preserve">   - Gestión de competencias por cargo</w:t>
-      </w:r>
-    </w:p>
-    <w:p/>
-    <w:p>
-      <w:pPr>
-        <w:rPr>
-          <w:b/>
-          <w:bCs/>
-        </w:rPr>
-      </w:pPr>
-      <w:r>
-        <w:rPr>
-          <w:b/>
-          <w:bCs/>
-        </w:rPr>
-        <w:t>4. Control Agrícola</w:t>
-      </w:r>
-    </w:p>
-    <w:p>
-      <w:r>
-        <w:t xml:space="preserve">   - Monitoreo en tiempo real de cultivos</w:t>
-      </w:r>
-    </w:p>
-    <w:p>
-      <w:r>
-        <w:t xml:space="preserve">   - Planificación de cosechas</w:t>
-      </w:r>
-    </w:p>
-    <w:p>
-      <w:r>
-        <w:t xml:space="preserve">   - Control fitosanitario</w:t>
-      </w:r>
-    </w:p>
-    <w:p>
-      <w:r>
-        <w:t xml:space="preserve">   - Gestión de aplicaciones agronómicas</w:t>
-      </w:r>
-    </w:p>
-    <w:p/>
-    <w:p>
-      <w:pPr>
-        <w:rPr>
-          <w:b/>
-          <w:bCs/>
-        </w:rPr>
-      </w:pPr>
-      <w:r>
-        <w:rPr>
-          <w:b/>
-          <w:bCs/>
-        </w:rPr>
-        <w:t>5. Integración Operacional</w:t>
-      </w:r>
-    </w:p>
-    <w:p>
-      <w:r>
-        <w:t xml:space="preserve">   - Conexión entre módulos administrativos, agrícolas e industriales</w:t>
-      </w:r>
-    </w:p>
-    <w:p>
-      <w:r>
-        <w:t xml:space="preserve">   - Flujo de información desde campo hasta planta</w:t>
-      </w:r>
-    </w:p>
-    <w:p>
-      <w:r>
-        <w:t xml:space="preserve">   - Reportería unificada</w:t>
-      </w:r>
-    </w:p>
-    <w:p/>
-    <w:p>
-      <w:pPr>
-        <w:pStyle w:val="Prrafodelista"/>
-        <w:numPr>
-          <w:ilvl w:val="0"/>
-          <w:numId w:val="11"/>
-        </w:numPr>
-        <w:rPr>
-          <w:b/>
-          <w:bCs/>
-        </w:rPr>
-      </w:pPr>
-      <w:r>
-        <w:rPr>
-          <w:b/>
-          <w:bCs/>
-        </w:rPr>
-        <w:t>BENEFICIOS ESPERADOS</w:t>
-      </w:r>
-    </w:p>
-    <w:p>
-      <w:r>
-        <w:t>- ✅ Reducción del 60% en tiempo de gestión administrativa</w:t>
-      </w:r>
-    </w:p>
-    <w:p>
-      <w:r>
-        <w:t>- ✅ Trazabilidad completa de operaciones agrícolas</w:t>
-      </w:r>
-    </w:p>
-    <w:p>
-      <w:r>
-        <w:t>- ✅ Cumplimiento del 100% en capacitaciones obligatorias</w:t>
-      </w:r>
-    </w:p>
-    <w:p>
-      <w:r>
-        <w:t>- ✅ Centralización de información en una única plataforma</w:t>
-      </w:r>
-    </w:p>
-    <w:p>
-      <w:r>
-        <w:t>- ✅ Mejora en la comunicación organizacional</w:t>
-      </w:r>
-    </w:p>
-    <w:p>
-      <w:r>
-        <w:t>- ✅ Reducción de errores por registro manual</w:t>
-      </w:r>
-    </w:p>
-    <w:p/>
-    <w:p>
-      <w:r>
-        <w:lastRenderedPageBreak/>
-        <w:t>---------------------------------------------------------------------------------</w:t>
-      </w:r>
-    </w:p>
-    <w:p/>
-    <w:p>
-      <w:pPr>
-        <w:pStyle w:val="Prrafodelista"/>
-        <w:numPr>
-          <w:ilvl w:val="0"/>
-          <w:numId w:val="11"/>
-        </w:numPr>
-        <w:rPr>
-          <w:b/>
-          <w:bCs/>
-        </w:rPr>
-      </w:pPr>
-      <w:r>
-        <w:rPr>
-          <w:b/>
-          <w:bCs/>
-        </w:rPr>
-        <w:t>MÓDULOS Y ESTADO DE DESARROLLO</w:t>
-      </w:r>
-    </w:p>
-    <w:p>
-      <w:pPr>
-        <w:rPr>
-          <w:b/>
-          <w:bCs/>
-        </w:rPr>
-      </w:pPr>
-      <w:r>
-        <w:rPr>
-          <w:b/>
-          <w:bCs/>
-        </w:rPr>
-        <w:t>Resumen de Avance</w:t>
-      </w:r>
-    </w:p>
     <w:tbl>
       <w:tblPr>
         <w:tblStyle w:val="Tablaconcuadrcula"/>
@@ -1448,1136 +805,164 @@
         </w:tc>
       </w:tr>
     </w:tbl>
-    <w:p/>
-    <w:p>
-      <w:r>
-        <w:t>---------------------------------------------------------------------------------</w:t>
-      </w:r>
-    </w:p>
-    <w:p/>
-    <w:p>
-      <w:pPr>
-        <w:rPr>
-          <w:b/>
-          <w:bCs/>
-        </w:rPr>
-      </w:pPr>
-      <w:r>
-        <w:rPr>
-          <w:b/>
-          <w:bCs/>
-        </w:rPr>
-        <w:t>1. MÓDULO DE ADMINISTRACIÓN (M_ADMIN) -- 90% COMPLETADO</w:t>
-      </w:r>
-    </w:p>
-    <w:p>
-      <w:pPr>
-        <w:pStyle w:val="Prrafodelista"/>
-        <w:numPr>
-          <w:ilvl w:val="0"/>
-          <w:numId w:val="12"/>
-        </w:numPr>
-        <w:rPr>
-          <w:b/>
-          <w:bCs/>
-        </w:rPr>
-      </w:pPr>
-      <w:r>
-        <w:rPr>
-          <w:b/>
-          <w:bCs/>
-        </w:rPr>
-        <w:t>Funcionalidades Implementadas (90%):</w:t>
-      </w:r>
-    </w:p>
-    <w:p>
-      <w:r>
-        <w:t>- ✅ Gestión de usuarios administradores</w:t>
-      </w:r>
-    </w:p>
-    <w:p>
-      <w:r>
-        <w:t>- ✅ CRUD completo de colaboradores</w:t>
-      </w:r>
-    </w:p>
-    <w:p>
-      <w:r>
-        <w:t>- ✅ Asignación de roles y permisos</w:t>
-      </w:r>
-    </w:p>
-    <w:p>
-      <w:r>
-        <w:t>- ✅ Gestión de cargos y áreas</w:t>
-      </w:r>
-    </w:p>
-    <w:p>
-      <w:r>
-        <w:t>- ✅ Sincronización con base de datos SQL Server (colaboradores)</w:t>
-      </w:r>
-    </w:p>
-    <w:p>
-      <w:r>
-        <w:t>- ✅ Interfaz de edición de usuarios</w:t>
-      </w:r>
-    </w:p>
-    <w:p>
-      <w:r>
-        <w:t>- ✅ Interfaz de edición de colaboradores</w:t>
-      </w:r>
-    </w:p>
-    <w:p>
-      <w:r>
-        <w:t>- ✅ Sistema de búsqueda y filtrado</w:t>
-      </w:r>
-    </w:p>
-    <w:p/>
-    <w:p>
-      <w:pPr>
-        <w:pStyle w:val="Prrafodelista"/>
-        <w:numPr>
-          <w:ilvl w:val="0"/>
-          <w:numId w:val="12"/>
-        </w:numPr>
-        <w:rPr>
-          <w:b/>
-          <w:bCs/>
-        </w:rPr>
-      </w:pPr>
-      <w:r>
-        <w:rPr>
-          <w:b/>
-          <w:bCs/>
-        </w:rPr>
-        <w:t xml:space="preserve">En </w:t>
-      </w:r>
-      <w:r>
-        <w:rPr>
-          <w:b/>
-          <w:bCs/>
-        </w:rPr>
-        <w:t>Desarrollo (</w:t>
-      </w:r>
-      <w:r>
-        <w:rPr>
-          <w:b/>
-          <w:bCs/>
-        </w:rPr>
-        <w:t>10%):</w:t>
-      </w:r>
-    </w:p>
-    <w:p>
-      <w:r>
-        <w:t>- 🔄 Panel de auditoría de cambios</w:t>
-      </w:r>
-    </w:p>
-    <w:p>
-      <w:r>
-        <w:t>- 🔄 Reportes avanzados de usuarios</w:t>
-      </w:r>
-    </w:p>
-    <w:p>
-      <w:pPr>
-        <w:pStyle w:val="Prrafodelista"/>
-        <w:numPr>
-          <w:ilvl w:val="0"/>
-          <w:numId w:val="12"/>
-        </w:numPr>
-        <w:rPr>
-          <w:b/>
-          <w:bCs/>
-        </w:rPr>
-      </w:pPr>
-      <w:r>
-        <w:rPr>
-          <w:b/>
-          <w:bCs/>
-        </w:rPr>
-        <w:lastRenderedPageBreak/>
-        <w:t>Componentes:</w:t>
-      </w:r>
-    </w:p>
-    <w:p>
-      <w:r>
-        <w:rPr>
-          <mc:AlternateContent>
-            <mc:Choice Requires="w16se"/>
-            <mc:Fallback>
-              <w:rFonts w:ascii="Segoe UI Emoji" w:eastAsia="Segoe UI Emoji" w:hAnsi="Segoe UI Emoji" w:cs="Segoe UI Emoji"/>
-            </mc:Fallback>
-          </mc:AlternateContent>
-        </w:rPr>
-        <mc:AlternateContent>
-          <mc:Choice Requires="w16se">
-            <w16se:symEx w16se:font="Segoe UI Emoji" w16se:char="2699"/>
-          </mc:Choice>
-          <mc:Fallback>
-            <w:t>⚙</w:t>
-          </mc:Fallback>
-        </mc:AlternateContent>
-      </w:r>
-      <w:r>
-        <w:t>️</w:t>
-      </w:r>
-      <w:r>
-        <w:t xml:space="preserve"> `ed_usuario.html` - Edición de usuarios administradores</w:t>
-      </w:r>
-    </w:p>
-    <w:p>
-      <w:r>
-        <w:rPr>
-          <w:rFonts w:ascii="Segoe UI Emoji" w:eastAsia="Segoe UI Emoji" w:hAnsi="Segoe UI Emoji" w:cs="Segoe UI Emoji"/>
-        </w:rPr>
-        <w:t>⚙</w:t>
-      </w:r>
-      <w:r>
-        <w:t>️</w:t>
-      </w:r>
-      <w:r>
-        <w:t xml:space="preserve"> `ed_uscolaboradores.html` - Edición de colaboradores</w:t>
-      </w:r>
-    </w:p>
-    <w:p>
-      <w:r>
-        <w:rPr>
-          <w:rFonts w:ascii="Segoe UI Emoji" w:eastAsia="Segoe UI Emoji" w:hAnsi="Segoe UI Emoji" w:cs="Segoe UI Emoji"/>
-        </w:rPr>
-        <w:t>⚙</w:t>
-      </w:r>
-      <w:r>
-        <w:t>️</w:t>
-      </w:r>
-      <w:r>
-        <w:t>`usuarios_api.php` - API de gestión de usuarios</w:t>
-      </w:r>
-    </w:p>
-    <w:p>
-      <w:r>
-        <w:rPr>
-          <w:rFonts w:ascii="Segoe UI Emoji" w:eastAsia="Segoe UI Emoji" w:hAnsi="Segoe UI Emoji" w:cs="Segoe UI Emoji"/>
-        </w:rPr>
-        <w:t>⚙</w:t>
-      </w:r>
-      <w:r>
-        <w:t>️</w:t>
-      </w:r>
-      <w:r>
-        <w:t>`colaboradores_api.php` - API de gestión de colaboradores</w:t>
-      </w:r>
-    </w:p>
-    <w:p>
-      <w:r>
-        <w:rPr>
-          <w:rFonts w:ascii="Segoe UI Emoji" w:eastAsia="Segoe UI Emoji" w:hAnsi="Segoe UI Emoji" w:cs="Segoe UI Emoji"/>
-        </w:rPr>
-        <w:t>⚙</w:t>
-      </w:r>
-      <w:r>
-        <w:t>️</w:t>
-      </w:r>
-      <w:r>
-        <w:t>`usuarios.js`, `colaboradores.js` - Lógica del frontend</w:t>
-      </w:r>
-    </w:p>
-    <w:p/>
-    <w:p>
-      <w:r>
-        <w:t>---------------------------------------------------------------------------------</w:t>
-      </w:r>
-    </w:p>
-    <w:p/>
-    <w:p>
-      <w:pPr>
-        <w:rPr>
-          <w:b/>
-          <w:bCs/>
-        </w:rPr>
-      </w:pPr>
-      <w:r>
-        <w:rPr>
-          <w:b/>
-          <w:bCs/>
-        </w:rPr>
-        <w:t xml:space="preserve">2. MÓDULO DE CAPACITACIONES (M_CAPACITACIONES) - </w:t>
-      </w:r>
-      <w:r>
-        <w:rPr>
-          <w:b/>
-          <w:bCs/>
-        </w:rPr>
-        <w:t>90</w:t>
-      </w:r>
-      <w:r>
-        <w:rPr>
-          <w:b/>
-          <w:bCs/>
-        </w:rPr>
-        <w:t>% COMPLETADO</w:t>
-      </w:r>
-    </w:p>
-    <w:p>
-      <w:pPr>
-        <w:pStyle w:val="Prrafodelista"/>
-        <w:numPr>
-          <w:ilvl w:val="0"/>
-          <w:numId w:val="12"/>
-        </w:numPr>
-        <w:rPr>
-          <w:b/>
-          <w:bCs/>
-        </w:rPr>
-      </w:pPr>
-      <w:r>
-        <w:rPr>
-          <w:b/>
-          <w:bCs/>
-        </w:rPr>
-        <w:t>Funcionalidades Implementadas (</w:t>
-      </w:r>
-      <w:r>
-        <w:rPr>
-          <w:b/>
-          <w:bCs/>
-        </w:rPr>
-        <w:t>90</w:t>
-      </w:r>
-      <w:r>
-        <w:rPr>
-          <w:b/>
-          <w:bCs/>
-        </w:rPr>
-        <w:t>%):</w:t>
-      </w:r>
-    </w:p>
-    <w:p>
-      <w:r>
-        <w:t>- ✅ Registro de capacitaciones (formulario completo)</w:t>
-      </w:r>
-    </w:p>
-    <w:p>
-      <w:r>
-        <w:t>- ✅ Gestión de asistentes con importación CSV</w:t>
-      </w:r>
-    </w:p>
-    <w:p>
-      <w:r>
-        <w:t>- ✅ Programación de capacitaciones por cargo</w:t>
-      </w:r>
-    </w:p>
-    <w:p>
-      <w:r>
-        <w:t>- ✅ Sistema de notificaciones automáticas</w:t>
-      </w:r>
-    </w:p>
-    <w:p>
-      <w:r>
-        <w:t>- ✅ Cálculo de fechas de vencimiento</w:t>
-      </w:r>
-    </w:p>
-    <w:p>
-      <w:r>
-        <w:t>- ✅ Consulta y búsqueda de capacitaciones históricas</w:t>
-      </w:r>
-    </w:p>
-    <w:p>
-      <w:r>
-        <w:t>- ✅ Edición de capacitaciones existentes</w:t>
-      </w:r>
-    </w:p>
-    <w:p>
-      <w:r>
-        <w:t>- ✅ Seguimiento de progreso por colaborador</w:t>
-      </w:r>
-    </w:p>
-    <w:p>
-      <w:r>
-        <w:t>- ✅ Gestión de temas (81 temas configurados)</w:t>
-      </w:r>
-    </w:p>
-    <w:p>
-      <w:r>
-        <w:t>- ✅ Gestión de tipos de actividad</w:t>
-      </w:r>
-    </w:p>
-    <w:p>
-      <w:r>
-        <w:t>- ✅ Gestión de lugares de capacitación</w:t>
-      </w:r>
-    </w:p>
-    <w:p>
-      <w:r>
-        <w:t>- ✅ Gestión de procesos</w:t>
-      </w:r>
-    </w:p>
-    <w:p>
-      <w:r>
-        <w:t>- ✅ Upload de archivos adjuntos</w:t>
-      </w:r>
-    </w:p>
-    <w:p>
-      <w:r>
-        <w:t>- ✅ Vista de progreso de capacitaciones</w:t>
-      </w:r>
-    </w:p>
-    <w:p/>
-    <w:p>
-      <w:pPr>
-        <w:pStyle w:val="Prrafodelista"/>
-        <w:numPr>
-          <w:ilvl w:val="0"/>
-          <w:numId w:val="12"/>
-        </w:numPr>
-        <w:rPr>
-          <w:b/>
-          <w:bCs/>
-        </w:rPr>
-      </w:pPr>
-      <w:r>
-        <w:rPr>
-          <w:b/>
-          <w:bCs/>
-        </w:rPr>
-        <w:t>En Desarrollo (</w:t>
-      </w:r>
-      <w:r>
-        <w:rPr>
-          <w:b/>
-          <w:bCs/>
-        </w:rPr>
-        <w:t>5</w:t>
-      </w:r>
-      <w:r>
-        <w:rPr>
-          <w:b/>
-          <w:bCs/>
-        </w:rPr>
-        <w:t>%):</w:t>
-      </w:r>
-    </w:p>
-    <w:p>
-      <w:r>
-        <w:t>- 🔄 Generación automática de certificados</w:t>
-      </w:r>
-    </w:p>
-    <w:p>
-      <w:r>
-        <w:t>- 🔄 Reportes estadísticos avanzados</w:t>
-      </w:r>
-    </w:p>
-    <w:p/>
-    <w:p>
-      <w:pPr>
-        <w:pStyle w:val="Prrafodelista"/>
-        <w:numPr>
-          <w:ilvl w:val="0"/>
-          <w:numId w:val="12"/>
-        </w:numPr>
-        <w:rPr>
-          <w:b/>
-          <w:bCs/>
-        </w:rPr>
-      </w:pPr>
-      <w:r>
-        <w:rPr>
-          <w:b/>
-          <w:bCs/>
-        </w:rPr>
-        <w:t>Planificado (5%):</w:t>
-      </w:r>
-    </w:p>
-    <w:p>
-      <w:r>
-        <w:t>- 📋 Integración con calendario corporativo</w:t>
-      </w:r>
-    </w:p>
-    <w:p>
-      <w:r>
-        <w:t>- 📋 Recordatorios por email/SMS</w:t>
-      </w:r>
-    </w:p>
-    <w:p/>
-    <w:p>
-      <w:pPr>
-        <w:pStyle w:val="Prrafodelista"/>
-        <w:numPr>
-          <w:ilvl w:val="0"/>
-          <w:numId w:val="12"/>
-        </w:numPr>
-        <w:rPr>
-          <w:b/>
-          <w:bCs/>
-        </w:rPr>
-      </w:pPr>
-      <w:r>
-        <w:rPr>
-          <w:b/>
-          <w:bCs/>
-        </w:rPr>
-        <w:t>Componentes:</w:t>
-      </w:r>
-    </w:p>
-    <w:p>
-      <w:r>
-        <w:rPr>
-          <w:rFonts w:ascii="Segoe UI Emoji" w:eastAsia="Segoe UI Emoji" w:hAnsi="Segoe UI Emoji" w:cs="Segoe UI Emoji"/>
-        </w:rPr>
-        <w:t>⚙</w:t>
-      </w:r>
-      <w:r>
-        <w:t>️</w:t>
-      </w:r>
-      <w:r>
-        <w:t xml:space="preserve"> `formulario.html` - Registro de nueva capacitación</w:t>
-      </w:r>
-    </w:p>
-    <w:p>
-      <w:r>
-        <w:rPr>
-          <w:rFonts w:ascii="Segoe UI Emoji" w:eastAsia="Segoe UI Emoji" w:hAnsi="Segoe UI Emoji" w:cs="Segoe UI Emoji"/>
-        </w:rPr>
-        <w:t>⚙</w:t>
-      </w:r>
-      <w:r>
-        <w:t>️</w:t>
-      </w:r>
-      <w:r>
-        <w:t xml:space="preserve"> `ed_formulario.html` - Edición de capacitación existente</w:t>
-      </w:r>
-    </w:p>
-    <w:p>
-      <w:r>
-        <w:rPr>
-          <w:rFonts w:ascii="Segoe UI Emoji" w:eastAsia="Segoe UI Emoji" w:hAnsi="Segoe UI Emoji" w:cs="Segoe UI Emoji"/>
-        </w:rPr>
-        <w:t>⚙</w:t>
-      </w:r>
-      <w:r>
-        <w:t>️</w:t>
-      </w:r>
-      <w:r>
-        <w:t>`programacion.html` - Programación de capacitaciones</w:t>
-      </w:r>
-    </w:p>
-    <w:p>
-      <w:r>
-        <w:rPr>
-          <w:rFonts w:ascii="Segoe UI Emoji" w:eastAsia="Segoe UI Emoji" w:hAnsi="Segoe UI Emoji" w:cs="Segoe UI Emoji"/>
-        </w:rPr>
-        <w:t>⚙</w:t>
-      </w:r>
-      <w:r>
-        <w:t>️</w:t>
-      </w:r>
-      <w:r>
-        <w:t>`Consultas_capacitacion.html` - Búsqueda y consulta histórica</w:t>
-      </w:r>
-    </w:p>
-    <w:p>
-      <w:r>
-        <w:rPr>
-          <w:rFonts w:ascii="Segoe UI Emoji" w:eastAsia="Segoe UI Emoji" w:hAnsi="Segoe UI Emoji" w:cs="Segoe UI Emoji"/>
-        </w:rPr>
-        <w:t>⚙</w:t>
-      </w:r>
-      <w:r>
-        <w:t>️</w:t>
-      </w:r>
-      <w:r>
-        <w:t>APIs: `formulario_api.php`, `ed_formulario_api.php`, `programacion_api.php`, `consultas_capacitacion_api.php`, `notificaciones_api.php`, `progreso_api.php`, `file_upload_api.php`</w:t>
-      </w:r>
-    </w:p>
-    <w:p>
-      <w:r>
-        <w:rPr>
-          <w:rFonts w:ascii="Segoe UI Emoji" w:eastAsia="Segoe UI Emoji" w:hAnsi="Segoe UI Emoji" w:cs="Segoe UI Emoji"/>
-        </w:rPr>
-        <w:t>⚙</w:t>
-      </w:r>
-      <w:r>
-        <w:t>️</w:t>
-      </w:r>
-      <w:r>
-        <w:t>Scripts JS: `formulario.js`, `ed_formulario.js`, `programacion.js`, `consulta-cap.js`, `capacitaciones.js`</w:t>
-      </w:r>
-    </w:p>
-    <w:p/>
-    <w:p>
-      <w:pPr>
-        <w:pStyle w:val="Prrafodelista"/>
-        <w:numPr>
-          <w:ilvl w:val="0"/>
-          <w:numId w:val="12"/>
-        </w:numPr>
-        <w:rPr>
-          <w:b/>
-          <w:bCs/>
-        </w:rPr>
-      </w:pPr>
-      <w:r>
-        <w:rPr>
-          <w:b/>
-          <w:bCs/>
-        </w:rPr>
-        <w:t>Tablas de Base de Datos:</w:t>
-      </w:r>
-    </w:p>
-    <w:p>
-      <w:r>
-        <w:rPr>
-          <mc:AlternateContent>
-            <mc:Choice Requires="w16se"/>
-            <mc:Fallback>
-              <w:rFonts w:ascii="Segoe UI Emoji" w:eastAsia="Segoe UI Emoji" w:hAnsi="Segoe UI Emoji" w:cs="Segoe UI Emoji"/>
-            </mc:Fallback>
-          </mc:AlternateContent>
-        </w:rPr>
-        <mc:AlternateContent>
-          <mc:Choice Requires="w16se">
-            <w16se:symEx w16se:font="Segoe UI Emoji" w16se:char="1F4DD"/>
-          </mc:Choice>
-          <mc:Fallback>
-            <w:t>📝</w:t>
-          </mc:Fallback>
-        </mc:AlternateContent>
-      </w:r>
-      <w:r>
-        <w:t>`cap_formulario` -</w:t>
-      </w:r>
-      <w:r>
-        <w:t>-</w:t>
-      </w:r>
-      <w:r>
-        <w:t xml:space="preserve"> Capacitaciones registradas</w:t>
-      </w:r>
-    </w:p>
-    <w:p>
-      <w:r>
-        <w:rPr>
-          <w:rFonts w:ascii="Segoe UI Emoji" w:eastAsia="Segoe UI Emoji" w:hAnsi="Segoe UI Emoji" w:cs="Segoe UI Emoji"/>
-        </w:rPr>
-        <w:t>📝</w:t>
-      </w:r>
-      <w:r>
-        <w:t>`cap_formulario_asistente` -</w:t>
-      </w:r>
-      <w:r>
-        <w:t>-</w:t>
-      </w:r>
-      <w:r>
-        <w:t xml:space="preserve"> Asistentes por capacitación</w:t>
-      </w:r>
-    </w:p>
-    <w:p>
-      <w:r>
-        <w:rPr>
-          <w:rFonts w:ascii="Segoe UI Emoji" w:eastAsia="Segoe UI Emoji" w:hAnsi="Segoe UI Emoji" w:cs="Segoe UI Emoji"/>
-        </w:rPr>
-        <w:t>📝</w:t>
-      </w:r>
-      <w:r>
-        <w:t>`cap_programacion` -</w:t>
-      </w:r>
-      <w:r>
-        <w:t>-</w:t>
-      </w:r>
-      <w:r>
-        <w:t xml:space="preserve"> Programación por cargo</w:t>
-      </w:r>
-    </w:p>
-    <w:p>
-      <w:r>
-        <w:rPr>
-          <w:rFonts w:ascii="Segoe UI Emoji" w:eastAsia="Segoe UI Emoji" w:hAnsi="Segoe UI Emoji" w:cs="Segoe UI Emoji"/>
-        </w:rPr>
-        <w:t>📝</w:t>
-      </w:r>
-      <w:r>
-        <w:t>`cap_notificaciones` -</w:t>
-      </w:r>
-      <w:r>
-        <w:t>-</w:t>
-      </w:r>
-      <w:r>
-        <w:t xml:space="preserve"> Notificaciones de vencimiento</w:t>
-      </w:r>
-    </w:p>
-    <w:p>
-      <w:r>
-        <w:rPr>
-          <w:rFonts w:ascii="Segoe UI Emoji" w:eastAsia="Segoe UI Emoji" w:hAnsi="Segoe UI Emoji" w:cs="Segoe UI Emoji"/>
-        </w:rPr>
-        <w:t>📝</w:t>
-      </w:r>
-      <w:r>
-        <w:t>`cap_tema` -</w:t>
-      </w:r>
-      <w:r>
-        <w:t>-</w:t>
-      </w:r>
-      <w:r>
-        <w:t xml:space="preserve"> Catálogo de temas </w:t>
-      </w:r>
-    </w:p>
-    <w:p>
-      <w:r>
-        <w:rPr>
-          <w:rFonts w:ascii="Segoe UI Emoji" w:eastAsia="Segoe UI Emoji" w:hAnsi="Segoe UI Emoji" w:cs="Segoe UI Emoji"/>
-        </w:rPr>
-        <w:lastRenderedPageBreak/>
-        <w:t>📝</w:t>
-      </w:r>
-      <w:r>
-        <w:t xml:space="preserve">`cap_tipo_actividad` - Tipos </w:t>
-      </w:r>
-    </w:p>
-    <w:p>
-      <w:r>
-        <w:rPr>
-          <w:rFonts w:ascii="Segoe UI Emoji" w:eastAsia="Segoe UI Emoji" w:hAnsi="Segoe UI Emoji" w:cs="Segoe UI Emoji"/>
-        </w:rPr>
-        <w:t>📝</w:t>
-      </w:r>
-      <w:r>
-        <w:t>`cap_lugar` - Lugares disponibles</w:t>
-      </w:r>
-    </w:p>
-    <w:p>
-      <w:r>
-        <w:rPr>
-          <w:rFonts w:ascii="Segoe UI Emoji" w:eastAsia="Segoe UI Emoji" w:hAnsi="Segoe UI Emoji" w:cs="Segoe UI Emoji"/>
-        </w:rPr>
-        <w:t>📝</w:t>
-      </w:r>
-      <w:r>
-        <w:t>`cap_proceso` - Procesos asociados</w:t>
-      </w:r>
-    </w:p>
-    <w:p>
-      <w:r>
-        <w:rPr>
-          <w:rFonts w:ascii="Segoe UI Emoji" w:eastAsia="Segoe UI Emoji" w:hAnsi="Segoe UI Emoji" w:cs="Segoe UI Emoji"/>
-        </w:rPr>
-        <w:t>📝</w:t>
-      </w:r>
-      <w:r>
-        <w:t>`v_progreso_capacitaciones` - Vista de progreso</w:t>
-      </w:r>
-    </w:p>
-    <w:p>
-      <w:r>
-        <w:t>---</w:t>
-      </w:r>
-      <w:r>
-        <w:t>----------------------------------------------------------------------------</w:t>
-      </w:r>
-    </w:p>
-    <w:p>
-      <w:pPr>
-        <w:rPr>
-          <w:b/>
-          <w:bCs/>
-        </w:rPr>
-      </w:pPr>
-      <w:r>
-        <w:rPr>
-          <w:b/>
-          <w:bCs/>
-        </w:rPr>
-        <w:t>3. Módulo Agronómico (m_agronomia)</w:t>
-      </w:r>
-      <w:r>
-        <w:rPr>
-          <w:b/>
-          <w:bCs/>
-        </w:rPr>
-        <w:t xml:space="preserve"> </w:t>
-      </w:r>
-      <w:r>
-        <w:rPr>
-          <w:b/>
-          <w:bCs/>
-        </w:rPr>
-        <w:t xml:space="preserve">- </w:t>
-      </w:r>
-      <w:r>
-        <w:rPr>
-          <w:b/>
-          <w:bCs/>
-        </w:rPr>
-        <w:t>9</w:t>
-      </w:r>
-      <w:r>
-        <w:rPr>
-          <w:b/>
-          <w:bCs/>
-        </w:rPr>
-        <w:t>5% Completado</w:t>
-      </w:r>
-    </w:p>
-    <w:p>
-      <w:r>
-        <w:t xml:space="preserve">Este es el módulo más extenso del sistema con </w:t>
-      </w:r>
-      <w:r>
-        <w:t xml:space="preserve">más de </w:t>
-      </w:r>
-      <w:r>
-        <w:t>98 archivos entre HTML, PHP y JavaScript.</w:t>
-      </w:r>
-    </w:p>
-    <w:p>
-      <w:pPr>
-        <w:pStyle w:val="Prrafodelista"/>
-        <w:numPr>
-          <w:ilvl w:val="0"/>
-          <w:numId w:val="12"/>
-        </w:numPr>
-        <w:rPr>
-          <w:b/>
-          <w:bCs/>
-        </w:rPr>
-      </w:pPr>
-      <w:r>
-        <w:rPr>
-          <w:b/>
-          <w:bCs/>
-        </w:rPr>
-        <w:t>Funcionalidades Implementadas</w:t>
-      </w:r>
-      <w:r>
-        <w:rPr>
-          <w:b/>
-          <w:bCs/>
-        </w:rPr>
-        <w:t xml:space="preserve"> </w:t>
-      </w:r>
-      <w:r>
-        <w:rPr>
-          <w:b/>
-          <w:bCs/>
-        </w:rPr>
-        <w:t>(95%):</w:t>
-      </w:r>
-    </w:p>
-    <w:p>
-      <w:r>
-        <w:t>- ✅ Monitoreo de plagas</w:t>
-      </w:r>
-    </w:p>
-    <w:p>
-      <w:r>
-        <w:t>- ✅ Control de enfermedades</w:t>
-      </w:r>
-    </w:p>
-    <w:p>
-      <w:r>
-        <w:t>- ✅ Gestión de fertilización orgánica y química</w:t>
-      </w:r>
-    </w:p>
-    <w:p>
-      <w:r>
-        <w:t>- ✅ Registro de cosecha de fruta</w:t>
-      </w:r>
-    </w:p>
-    <w:p>
-      <w:r>
-        <w:t>- ✅ Control de calidad de fruta</w:t>
-      </w:r>
-    </w:p>
-    <w:p>
-      <w:r>
-        <w:t>- ✅ Monitoreo de trampas</w:t>
-      </w:r>
-    </w:p>
-    <w:p>
-      <w:r>
-        <w:t>- ✅ Gestión de mantenimientos agrícolas</w:t>
-      </w:r>
-    </w:p>
-    <w:p>
-      <w:r>
-        <w:t>- ✅ Control de oficios varios en palma</w:t>
-      </w:r>
-    </w:p>
-    <w:p>
-      <w:r>
-        <w:t>- ✅ Monitoreo de nivel freático</w:t>
-      </w:r>
-    </w:p>
-    <w:p>
-      <w:r>
-        <w:t>- ✅ Programación de fechas de corte</w:t>
-      </w:r>
-    </w:p>
-    <w:p>
-      <w:r>
-        <w:t>- ✅ Aprobación de monitoreos generales</w:t>
-      </w:r>
-    </w:p>
-    <w:p>
-      <w:r>
-        <w:t>- ✅ Sistema de eventos pendientes</w:t>
-      </w:r>
-    </w:p>
-    <w:p>
-      <w:r>
-        <w:t>- ✅ Reportes de lotes con monitoreo</w:t>
-      </w:r>
-    </w:p>
-    <w:p/>
-    <w:p>
-      <w:pPr>
-        <w:pStyle w:val="Prrafodelista"/>
-        <w:numPr>
-          <w:ilvl w:val="0"/>
-          <w:numId w:val="12"/>
-        </w:numPr>
-        <w:rPr>
-          <w:b/>
-          <w:bCs/>
-        </w:rPr>
-      </w:pPr>
-      <w:r>
-        <w:rPr>
-          <w:b/>
-          <w:bCs/>
-        </w:rPr>
-        <w:t>En Desarrollo (5%):</w:t>
-      </w:r>
-    </w:p>
-    <w:p>
-      <w:r>
-        <w:t>- 🔄 Dashboard analítico de producción</w:t>
-      </w:r>
-    </w:p>
-    <w:p>
-      <w:r>
-        <w:lastRenderedPageBreak/>
-        <w:t>- 🔄 Predicción de cosechas</w:t>
-      </w:r>
-    </w:p>
-    <w:p>
-      <w:r>
-        <w:t>- 🔄 Integración con sensores IoT</w:t>
-      </w:r>
-    </w:p>
-    <w:p>
-      <w:r>
-        <w:t>- 🔄 Mapas de calor de incidencia</w:t>
-      </w:r>
-    </w:p>
-    <w:p/>
-    <w:p/>
-    <w:p>
-      <w:pPr>
-        <w:pStyle w:val="Prrafodelista"/>
-        <w:numPr>
-          <w:ilvl w:val="0"/>
-          <w:numId w:val="12"/>
-        </w:numPr>
-        <w:rPr>
-          <w:b/>
-          <w:bCs/>
-        </w:rPr>
-      </w:pPr>
-      <w:r>
-        <w:rPr>
-          <w:b/>
-          <w:bCs/>
-        </w:rPr>
-        <w:t>Componentes Principales:</w:t>
-      </w:r>
-    </w:p>
-    <w:p>
-      <w:r>
-        <w:rPr>
-          <w:rFonts w:ascii="Segoe UI Emoji" w:hAnsi="Segoe UI Emoji" w:cs="Segoe UI Emoji"/>
-        </w:rPr>
-        <w:t xml:space="preserve"> </w:t>
-      </w:r>
-      <w:r>
-        <w:rPr>
-          <w:rFonts w:ascii="Segoe UI Emoji" w:hAnsi="Segoe UI Emoji" w:cs="Segoe UI Emoji"/>
-        </w:rPr>
-        <w:t>⚙️</w:t>
-      </w:r>
-      <w:r>
-        <w:t>`tb_agronomia.html` - Tabla principal de agronomía</w:t>
-      </w:r>
-    </w:p>
-    <w:p>
-      <w:r>
-        <w:t xml:space="preserve"> </w:t>
-      </w:r>
-      <w:r>
-        <w:rPr>
-          <w:rFonts w:ascii="Segoe UI Emoji" w:hAnsi="Segoe UI Emoji" w:cs="Segoe UI Emoji"/>
-        </w:rPr>
-        <w:t>⚙️</w:t>
-      </w:r>
-      <w:r>
-        <w:t xml:space="preserve"> </w:t>
-      </w:r>
-      <w:r>
-        <w:t>`f_cortes.html` - Programación de fechas de corte</w:t>
-      </w:r>
-    </w:p>
-    <w:p>
-      <w:r>
-        <w:rPr>
-          <w:rFonts w:ascii="Segoe UI Emoji" w:hAnsi="Segoe UI Emoji" w:cs="Segoe UI Emoji"/>
-        </w:rPr>
-        <w:t>⚙️</w:t>
-      </w:r>
-      <w:r>
-        <w:t xml:space="preserve"> </w:t>
-      </w:r>
-      <w:r>
-        <w:t>Más de 50 archivos PHP para diferentes operaciones agronómicas</w:t>
-      </w:r>
-    </w:p>
-    <w:p>
-      <w:r>
-        <w:rPr>
-          <w:rFonts w:ascii="Segoe UI Emoji" w:hAnsi="Segoe UI Emoji" w:cs="Segoe UI Emoji"/>
-        </w:rPr>
-        <w:t>⚙️</w:t>
-      </w:r>
-      <w:r>
-        <w:t xml:space="preserve"> </w:t>
-      </w:r>
-      <w:r>
-        <w:t>Scripts especializados para cada sub-proceso</w:t>
-      </w:r>
-    </w:p>
-    <w:p>
-      <w:r>
-        <w:rPr>
-          <w:rFonts w:ascii="Segoe UI Emoji" w:hAnsi="Segoe UI Emoji" w:cs="Segoe UI Emoji"/>
-        </w:rPr>
-        <w:t>⚙️</w:t>
-      </w:r>
-      <w:r>
-        <w:t xml:space="preserve"> </w:t>
-      </w:r>
-      <w:r>
-        <w:t>`gestion_permisos_agronomia.html` - Programación de permiso por roles para visualizar tablas</w:t>
-      </w:r>
-    </w:p>
-    <w:p>
-      <w:pPr>
-        <w:rPr>
-          <w:b/>
-          <w:bCs/>
-        </w:rPr>
-      </w:pPr>
-    </w:p>
-    <w:p>
-      <w:pPr>
-        <w:pStyle w:val="Prrafodelista"/>
-        <w:numPr>
-          <w:ilvl w:val="0"/>
-          <w:numId w:val="12"/>
-        </w:numPr>
-        <w:rPr>
-          <w:b/>
-          <w:bCs/>
-        </w:rPr>
-      </w:pPr>
-      <w:r>
-        <w:rPr>
-          <w:b/>
-          <w:bCs/>
-        </w:rPr>
-        <w:t>Sub-procesos Agronómicos:</w:t>
-      </w:r>
-    </w:p>
-    <w:p>
-      <w:r>
-        <w:t>1. **Monitoreo de Plagas**: Registro y seguimiento de incidencia de plagas</w:t>
-      </w:r>
-    </w:p>
-    <w:p>
-      <w:r>
-        <w:t>2. **Control Fitosanitario**: Gestión de aplicaciones y tratamientos</w:t>
-      </w:r>
-    </w:p>
-    <w:p>
-      <w:r>
-        <w:t>3. **Fertilización**: Control de aplicaciones orgánicas y químicas</w:t>
-      </w:r>
-    </w:p>
-    <w:p>
-      <w:r>
-        <w:t>4. **Cosecha**: Registro de RFF (Racimos de Fruta Fresca)</w:t>
-      </w:r>
-    </w:p>
-    <w:p>
-      <w:r>
-        <w:t>5. **Calidad**: Control de calidad de fruta</w:t>
-      </w:r>
-    </w:p>
-    <w:p>
-      <w:r>
-        <w:t>6. **Mantenimiento**: Gestión de labores de mantenimiento</w:t>
-      </w:r>
-    </w:p>
-    <w:p>
-      <w:r>
-        <w:t>7. **Trampas**: Monitoreo de trampas para control de plagas</w:t>
-      </w:r>
-    </w:p>
-    <w:p>
-      <w:r>
-        <w:t>8. **Nivel Freático**: Control de agua subterránea</w:t>
-      </w:r>
-    </w:p>
-    <w:p/>
-    <w:p>
-      <w:pPr>
-        <w:pStyle w:val="Prrafodelista"/>
-        <w:numPr>
-          <w:ilvl w:val="0"/>
-          <w:numId w:val="12"/>
-        </w:numPr>
-        <w:rPr>
-          <w:b/>
-          <w:bCs/>
-        </w:rPr>
-      </w:pPr>
-      <w:r>
-        <w:rPr>
-          <w:b/>
-          <w:bCs/>
-        </w:rPr>
-        <w:t>Tablas Principales:</w:t>
-      </w:r>
-    </w:p>
-    <w:p>
-      <w:r>
-        <w:t>- `agr_fecha_corte` - Programación de cortes</w:t>
-      </w:r>
-    </w:p>
-    <w:p>
-      <w:r>
-        <w:t xml:space="preserve">   </w:t>
-      </w:r>
-      <w:r>
-        <w:t>`</w:t>
-      </w:r>
-      <w:r>
-        <w:t>gestión_permisos</w:t>
-      </w:r>
-      <w:r>
-        <w:t xml:space="preserve">` - Programación </w:t>
-      </w:r>
-      <w:r>
-        <w:t xml:space="preserve">permisos por roles </w:t>
-      </w:r>
-    </w:p>
-    <w:p>
-      <w:r>
-        <w:lastRenderedPageBreak/>
-        <w:t>- Múltiples tablas para diferentes aspectos agronómicos</w:t>
+    <w:p>
+      <w:r>
+        <w:t>3. Módulo Agronómico (m_agronomia) - 95% Completado</w:t>
+      </w:r>
+    </w:p>
+    <w:p>
+      <w:r>
+        <w:t>Descripción general: núcleo operativo agrícola con más de 98 vistas, APIs y scripts JS en /m_agronomia (HTML + assets/css/js/php/config) que cubren trazabilidad de campo, calidad y planeación.</w:t>
+      </w:r>
+    </w:p>
+    <w:p>
+      <w:r>
+        <w:t>Cobertura funcional (95% implementado):</w:t>
+      </w:r>
+    </w:p>
+    <w:p>
+      <w:r>
+        <w:t>- ✅ Monitoreo fitosanitario: plagas, trampas y sanidad con flujos de aprobación/inactivación y auditoría (plagas_api.php, monitoreo_trampas_api.php, ct_cal_sanidad_api.php).</w:t>
+      </w:r>
+    </w:p>
+    <w:p>
+      <w:r>
+        <w:t>- ✅ Nutrición y fertilización: orgánica/química, compostaje, coberturas y compactación; seguimiento de polinización y floración (fertilizacion_organica_api.php, compostaje_api.php, coberturas_api.php, compactacion_api.php, polinizacion_api.php, ct_polinizacion_flores_api.php).</w:t>
+      </w:r>
+    </w:p>
+    <w:p>
+      <w:r>
+        <w:t>- ✅ Producción y cosecha: registros de cosecha y recolección de RFF, control de vagones, pérdidas y auditorías asociadas (cosecha_fruta_api.php, reco_fruta_api.php, aud_cosecha_api.php, aud_vagones_api.php, aud_perdidas_api.php, aud_maquinaria_api.php).</w:t>
+      </w:r>
+    </w:p>
+    <w:p>
+      <w:r>
+        <w:t>- ✅ Mantenimiento y labores diarias: labores_diarias_api.php, mantenimientos_api.php, oficios_varios_palma_api.php, erradicaciones_api.php, compactacion_api.php, nivel_freatico_api.php.</w:t>
+      </w:r>
+    </w:p>
+    <w:p>
+      <w:r>
+        <w:t>- ✅ Planeación y cortes: f_cortes.html + F_cortes.js con fecha_corte.php (tabla agr_fecha_corte) para definir ventanas de cosecha.</w:t>
+      </w:r>
+    </w:p>
+    <w:p>
+      <w:r>
+        <w:t>- ✅ Reportes y alertas: reporte_lote_monitoreo_api.php, get_global_counts.php, eventos_pendientes_operaciones.php, pendientes_operaciones.php, notificaciones_operaciones.js, init_noti_admin.js.</w:t>
+      </w:r>
+    </w:p>
+    <w:p>
+      <w:r>
+        <w:t>- ✅ Gestión de permisos: gestion_permisos_agronomia.html + manage_tab_permissions.php + role_guard_agronomia.js para habilitar pestañas según rol.</w:t>
+      </w:r>
+    </w:p>
+    <w:p>
+      <w:r>
+        <w:t>Pendiente (5%):</w:t>
+      </w:r>
+    </w:p>
+    <w:p>
+      <w:r>
+        <w:t>- 🔄 Dashboard analítico de producción con consolidado por lote y tendencia.</w:t>
+      </w:r>
+    </w:p>
+    <w:p>
+      <w:r>
+        <w:t>- 🔄 Predicción de cosechas y mapas de calor de incidencia (integración IoT/GIS).</w:t>
+      </w:r>
+    </w:p>
+    <w:p>
+      <w:r>
+        <w:t>- 🔄 Automatización de alertas avanzadas a partir de sensores.</w:t>
+      </w:r>
+    </w:p>
+    <w:p>
+      <w:r>
+        <w:t>Estructura y navegación:</w:t>
+      </w:r>
+    </w:p>
+    <w:p>
+      <w:r>
+        <w:t>- `tb_agronomia.html`: landing con accesos a cada subproceso, filtrado y indicadores rápidos.</w:t>
+      </w:r>
+    </w:p>
+    <w:p>
+      <w:r>
+        <w:t>- `f_cortes.html`: programación de fechas de corte y validación de rango activo.</w:t>
+      </w:r>
+    </w:p>
+    <w:p>
+      <w:r>
+        <w:t>- `gestion_permisos_agronomia.html`: matriz de permisos por rol/tab, persistida en manage_tab_permissions.php.</w:t>
+      </w:r>
+    </w:p>
+    <w:p>
+      <w:r>
+        <w:t>- Carpeta assets/: css (tema y tablas), js (lógica de cada subproceso, guardas y notificaciones), php (APIs REST-like con audit_logger y doble BD temporal/principal), config (conexiones y helpers).</w:t>
+      </w:r>
+    </w:p>
+    <w:p>
+      <w:r>
+        <w:t>Subprocesos detallados (JS ↔ API PHP ↔ tabla):</w:t>
+      </w:r>
+    </w:p>
+    <w:p>
+      <w:r>
+        <w:t>- Monitoreo fitosanitario: plagas.js ↔ plagas_api.php ↔ plagas; ct_cal_sanidad.js ↔ ct_cal_sanidad_api.php ↔ ct_cal_sanidad; ct_cal_trampas.js/monitoreo_trampas.js ↔ ct_cal_trampas_api.php y monitoreo_trampas_api.php ↔ ct_cal_trampas/monitoreo_trampas.</w:t>
+      </w:r>
+    </w:p>
+    <w:p>
+      <w:r>
+        <w:t>- Nutrición y fertilización: fertilizacion_organica.js ↔ fertilizacion_organica_api.php ↔ fertilizacion_organica; compostaje.js ↔ compostaje_api.php ↔ compostaje; coberturas.js ↔ coberturas_api.php ↔ coberturas; compactacion.js ↔ compactacion_api.php ↔ compactacion; polinizacion.js y ct_polinizacion_flores.js ↔ polinizacion_api.php/ct_polinizacion_flores_api.php ↔ polinizacion/ct_polinizacion_flores.</w:t>
+      </w:r>
+    </w:p>
+    <w:p>
+      <w:r>
+        <w:t>- Producción y cosecha: cosecha_fruta.js ↔ cosecha_fruta_api.php ↔ cosecha_fruta; reco_fruta.js ↔ reco_fruta_api.php ↔ reco_fruta; aud_cosecha.js ↔ aud_cosecha_api.php; aud_vagones.js ↔ aud_vagones_api.php; aud_perdidas.js ↔ aud_perdidas_api.php; aud_maquinaria.js ↔ aud_maquinaria_api.php.</w:t>
+      </w:r>
+    </w:p>
+    <w:p>
+      <w:r>
+        <w:t>- Labores y mantenimiento: labores_diarias.js ↔ labores_diarias_api.php ↔ labores_diarias; mantenimientos.js ↔ mantenimientos_api.php ↔ mantenimientos; oficios_varios_palma.js ↔ oficios_varios_palma_api.php ↔ oficios_varios_palma; erradicaciones.js ↔ erradicaciones_api.php ↔ erradicaciones; nivel_freatico.js ↔ nivel_freatico_api.php ↔ nivel_freatico.</w:t>
+      </w:r>
+    </w:p>
+    <w:p>
+      <w:r>
+        <w:t>- Siembras y vivero: siembra_nueva.js ↔ siembra_nueva_api.php ↔ siembra_nueva; resiembra.js ↔ resiembra_api.php ↔ resiembra; salida_vivero.js ↔ salida_vivero_api.php ↔ salida_vivero.</w:t>
+      </w:r>
+    </w:p>
+    <w:p>
+      <w:r>
+        <w:t>- Programación y control de cortes: F_cortes.js ↔ fecha_corte.php ↔ agr_fecha_corte; gestion.js + operaciones_aprobacion.php/pendientes_operaciones.php para flujos de aprobación; notificaciones_operaciones.js para avisos.</w:t>
+      </w:r>
+    </w:p>
+    <w:p>
+      <w:r>
+        <w:t>- Reportes y métricas: reporte_lote_monitoreo.js ↔ reporte_lote_monitoreo_api.php; get_global_counts.php para contadores en dashboard; eventos_pendientes_operaciones.php para bandeja de pendientes.</w:t>
+      </w:r>
+    </w:p>
+    <w:p>
+      <w:r>
+        <w:t>- Seguridad y permisos: role_guard_agronomia.js y role_permissions.js validan sesión/rol; require_admin.php en APIs sensibles; aud_* APIs registran operaciones críticas.</w:t>
+      </w:r>
+    </w:p>
+    <w:p>
+      <w:r>
+        <w:t>Tablas y vistas relevantes:</w:t>
+      </w:r>
+    </w:p>
+    <w:p>
+      <w:r>
+        <w:t>- `agr_fecha_corte`, `plagas`, `ct_cal_sanidad`, `monitoreo_trampas`, `ct_cal_trampas`, `compactacion`, `coberturas`, `compostaje`, `fertilizacion_organica`, `polinizacion`, `ct_polinizacion_flores`, `nivel_freatico`.</w:t>
+      </w:r>
+    </w:p>
+    <w:p>
+      <w:r>
+        <w:t>- `labores_diarias`, `mantenimientos`, `oficios_varios_palma`, `erradicaciones`, `siembra_nueva`, `resiembra`, `cosecha_fruta`, `reco_fruta` y tablas de auditoría asociadas (aud_*).</w:t>
+      </w:r>
+    </w:p>
+    <w:p>
+      <w:r>
+        <w:t>- Vistas y consultas de control: `reporte_lote_monitoreo` y contadores globales para paneles.</w:t>
       </w:r>
     </w:p>
     <w:p>

</xml_diff>

<commit_message>
Expand agronomia module documentation
Co-authored-by: Leonardom97 <100780990+Leonardom97@users.noreply.github.com>
</commit_message>
<xml_diff>
--- a/OSM_Documentacion.docx
+++ b/OSM_Documentacion.docx
@@ -2171,413 +2171,224 @@
       </w:r>
     </w:p>
     <w:p>
-      <w:pPr>
-        <w:rPr>
-          <w:b/>
-          <w:bCs/>
-        </w:rPr>
-      </w:pPr>
-      <w:r>
-        <w:rPr>
-          <w:b/>
-          <w:bCs/>
-        </w:rPr>
-        <w:t>3. Módulo Agronómico (m_agronomia)</w:t>
-      </w:r>
-      <w:r>
-        <w:rPr>
-          <w:b/>
-          <w:bCs/>
-        </w:rPr>
-        <w:t xml:space="preserve"> </w:t>
-      </w:r>
-      <w:r>
-        <w:rPr>
-          <w:b/>
-          <w:bCs/>
-        </w:rPr>
-        <w:t xml:space="preserve">- </w:t>
-      </w:r>
-      <w:r>
-        <w:rPr>
-          <w:b/>
-          <w:bCs/>
-        </w:rPr>
-        <w:t>9</w:t>
-      </w:r>
-      <w:r>
-        <w:rPr>
-          <w:b/>
-          <w:bCs/>
-        </w:rPr>
-        <w:t>5% Completado</w:t>
-      </w:r>
-    </w:p>
-    <w:p>
-      <w:r>
-        <w:t xml:space="preserve">Este es el módulo más extenso del sistema con </w:t>
-      </w:r>
-      <w:r>
-        <w:t xml:space="preserve">más de </w:t>
-      </w:r>
-      <w:r>
-        <w:t>98 archivos entre HTML, PHP y JavaScript.</w:t>
-      </w:r>
-    </w:p>
-    <w:p>
-      <w:pPr>
-        <w:pStyle w:val="Prrafodelista"/>
-        <w:numPr>
-          <w:ilvl w:val="0"/>
-          <w:numId w:val="12"/>
-        </w:numPr>
-        <w:rPr>
-          <w:b/>
-          <w:bCs/>
-        </w:rPr>
-      </w:pPr>
-      <w:r>
-        <w:rPr>
-          <w:b/>
-          <w:bCs/>
-        </w:rPr>
-        <w:t>Funcionalidades Implementadas</w:t>
-      </w:r>
-      <w:r>
-        <w:rPr>
-          <w:b/>
-          <w:bCs/>
-        </w:rPr>
-        <w:t xml:space="preserve"> </w:t>
-      </w:r>
-      <w:r>
-        <w:rPr>
-          <w:b/>
-          <w:bCs/>
-        </w:rPr>
-        <w:t>(95%):</w:t>
-      </w:r>
-    </w:p>
-    <w:p>
-      <w:r>
-        <w:t>- ✅ Monitoreo de plagas</w:t>
-      </w:r>
-    </w:p>
-    <w:p>
-      <w:r>
-        <w:t>- ✅ Control de enfermedades</w:t>
-      </w:r>
-    </w:p>
-    <w:p>
-      <w:r>
-        <w:t>- ✅ Gestión de fertilización orgánica y química</w:t>
-      </w:r>
-    </w:p>
-    <w:p>
-      <w:r>
-        <w:t>- ✅ Registro de cosecha de fruta</w:t>
-      </w:r>
-    </w:p>
-    <w:p>
-      <w:r>
-        <w:t>- ✅ Control de calidad de fruta</w:t>
-      </w:r>
-    </w:p>
-    <w:p>
-      <w:r>
-        <w:t>- ✅ Monitoreo de trampas</w:t>
-      </w:r>
-    </w:p>
-    <w:p>
-      <w:r>
-        <w:t>- ✅ Gestión de mantenimientos agrícolas</w:t>
-      </w:r>
-    </w:p>
-    <w:p>
-      <w:r>
-        <w:t>- ✅ Control de oficios varios en palma</w:t>
-      </w:r>
-    </w:p>
-    <w:p>
-      <w:r>
-        <w:t>- ✅ Monitoreo de nivel freático</w:t>
-      </w:r>
-    </w:p>
-    <w:p>
-      <w:r>
-        <w:t>- ✅ Programación de fechas de corte</w:t>
-      </w:r>
-    </w:p>
-    <w:p>
-      <w:r>
-        <w:t>- ✅ Aprobación de monitoreos generales</w:t>
-      </w:r>
-    </w:p>
-    <w:p>
-      <w:r>
-        <w:t>- ✅ Sistema de eventos pendientes</w:t>
-      </w:r>
-    </w:p>
-    <w:p>
-      <w:r>
-        <w:t>- ✅ Reportes de lotes con monitoreo</w:t>
+      <w:r>
+        <w:t>3. Módulo Agronómico (m_agronomia) - 95% Completado</w:t>
+      </w:r>
+    </w:p>
+    <w:p>
+      <w:r>
+        <w:t>Propósito: centralizar la operación agrícola (palma) desde campo hasta aprobación, con trazabilidad por lote, parcela y fecha de actividad.</w:t>
+      </w:r>
+    </w:p>
+    <w:p>
+      <w:r>
+        <w:t>Cobertura funcional (operativa):</w:t>
+      </w:r>
+    </w:p>
+    <w:p>
+      <w:r>
+        <w:t>- ✅ Monitoreo integrado de plagas y enfermedades (plagas, sanidad, trampas, coberturas).</w:t>
+      </w:r>
+    </w:p>
+    <w:p>
+      <w:r>
+        <w:t>- ✅ Gestión de fertilización orgánica y química, compostaje y aplicaciones registradas por jornada.</w:t>
+      </w:r>
+    </w:p>
+    <w:p>
+      <w:r>
+        <w:t>- ✅ Planeación y ejecución de siembra, resiembra y erradicaciones con seguimiento por responsable.</w:t>
+      </w:r>
+    </w:p>
+    <w:p>
+      <w:r>
+        <w:t>- ✅ Control de labores diarias, mantenimientos y oficios varios de palma con bitácora por equipo y empresa.</w:t>
+      </w:r>
+    </w:p>
+    <w:p>
+      <w:r>
+        <w:t>- ✅ Cosecha y postcosecha: RFF, recolección de fruta, auditorías de corte, pérdidas y vagones.</w:t>
+      </w:r>
+    </w:p>
+    <w:p>
+      <w:r>
+        <w:t>- ✅ Monitoreo de nivel freático, infraestructura y uso de maquinaria con estados de supervisión.</w:t>
+      </w:r>
+    </w:p>
+    <w:p>
+      <w:r>
+        <w:t>- ✅ Programación de fechas de corte, aprobación de monitoreos y tablero de eventos pendientes.</w:t>
+      </w:r>
+    </w:p>
+    <w:p>
+      <w:r>
+        <w:t>- ✅ Reportes operativos (lotes con monitoreo, notificaciones automáticas y métricas por pestaña).</w:t>
       </w:r>
     </w:p>
     <w:p/>
     <w:p>
-      <w:pPr>
-        <w:pStyle w:val="Prrafodelista"/>
-        <w:numPr>
-          <w:ilvl w:val="0"/>
-          <w:numId w:val="12"/>
-        </w:numPr>
-        <w:rPr>
-          <w:b/>
-          <w:bCs/>
-        </w:rPr>
-      </w:pPr>
-      <w:r>
-        <w:rPr>
-          <w:b/>
-          <w:bCs/>
-        </w:rPr>
-        <w:t>En Desarrollo (5%):</w:t>
-      </w:r>
-    </w:p>
-    <w:p>
-      <w:r>
-        <w:t>- 🔄 Dashboard analítico de producción</w:t>
-      </w:r>
-    </w:p>
-    <w:p>
-      <w:r>
-        <w:lastRenderedPageBreak/>
-        <w:t>- 🔄 Predicción de cosechas</w:t>
-      </w:r>
-    </w:p>
-    <w:p>
-      <w:r>
-        <w:t>- 🔄 Integración con sensores IoT</w:t>
-      </w:r>
-    </w:p>
-    <w:p>
-      <w:r>
-        <w:t>- 🔄 Mapas de calor de incidencia</w:t>
+      <w:r>
+        <w:t>Elementos en desarrollo (5%):</w:t>
+      </w:r>
+    </w:p>
+    <w:p>
+      <w:r>
+        <w:t>- 🔄 Dashboard analítico de producción con indicadores comparativos por lote y finca.</w:t>
+      </w:r>
+    </w:p>
+    <w:p>
+      <w:r>
+        <w:t>- 🔄 Predicción de cosechas y estimaciones por periodo.</w:t>
+      </w:r>
+    </w:p>
+    <w:p>
+      <w:r>
+        <w:t>- 🔄 Integración con sensores IoT para humedad/nivel freático y alertas tempranas.</w:t>
+      </w:r>
+    </w:p>
+    <w:p>
+      <w:r>
+        <w:t>- 🔄 Mapas de calor de incidencia y visualización geoespacial.</w:t>
       </w:r>
     </w:p>
     <w:p/>
+    <w:p>
+      <w:r>
+        <w:t>Flujos operativos principales:</w:t>
+      </w:r>
+    </w:p>
+    <w:p>
+      <w:r>
+        <w:t>- Monitoreo de plagas y sanidad: captura diaria de incidencias, trampas y coberturas mediante `plagas_api.php`, `monitoreo_trampas_api.php` y `ct_cal_sanidad_api.php`; visualización en pestañas dedicadas.</w:t>
+      </w:r>
+    </w:p>
+    <w:p>
+      <w:r>
+        <w:t>- Fertilización y coberturas: registro de aplicaciones orgánicas/químicas, compostaje y coberturas con `fertilizacion_organica_api.php`, `coberturas_api.php`, `compostaje.js` y controles de supervisión.</w:t>
+      </w:r>
+    </w:p>
+    <w:p>
+      <w:r>
+        <w:t>- Siembra, resiembra y erradicaciones: planeación y ejecución con trazabilidad por lote a través de `siembra_nueva_api.php`, `resiembra_api.php` y `erradicaciones_api.php`.</w:t>
+      </w:r>
+    </w:p>
+    <w:p>
+      <w:r>
+        <w:t>- Labores, mantenimientos y oficios varios: programación y cierre de labores (`labores_diarias_api.php`, `mantenimientos_api.php`, `oficios_varios_palma_api.php`) con auditoría de maquinaria (`aud_maquinaria_api.php`).</w:t>
+      </w:r>
+    </w:p>
+    <w:p>
+      <w:r>
+        <w:t>- Cosecha y calidad: seguimiento de corte y recolección (`cosecha_fruta_api.php`, `reco_fruta_api.php`), control de calidad y auditorías (`aud_cosecha_api.php`, `aud_fertilizacion_api.php`, `aud_perdidas_api.php`, `aud_vagones_api.php`, `ct_cal_trampas_api.php`, `ct_cal_labores_api.php`).</w:t>
+      </w:r>
+    </w:p>
+    <w:p>
+      <w:r>
+        <w:t>- Nivel freático y riego: monitoreo periódico mediante `nivel_freatico_api.php` y alertas configurables.</w:t>
+      </w:r>
+    </w:p>
+    <w:p>
+      <w:r>
+        <w:t>- Programación y aprobación: fechas de corte con `fecha_corte.php`, aprobación/pendientes con `operaciones_aprobacion.php`, `pendientes_operaciones.php` y `eventos_pendientes_operaciones.php`.</w:t>
+      </w:r>
+    </w:p>
     <w:p/>
     <w:p>
-      <w:pPr>
-        <w:pStyle w:val="Prrafodelista"/>
-        <w:numPr>
-          <w:ilvl w:val="0"/>
-          <w:numId w:val="12"/>
-        </w:numPr>
-        <w:rPr>
-          <w:b/>
-          <w:bCs/>
-        </w:rPr>
-      </w:pPr>
-      <w:r>
-        <w:rPr>
-          <w:b/>
-          <w:bCs/>
-        </w:rPr>
-        <w:t>Componentes Principales:</w:t>
-      </w:r>
-    </w:p>
-    <w:p>
-      <w:r>
-        <w:rPr>
-          <w:rFonts w:ascii="Segoe UI Emoji" w:hAnsi="Segoe UI Emoji" w:cs="Segoe UI Emoji"/>
-        </w:rPr>
-        <w:t xml:space="preserve"> </w:t>
-      </w:r>
-      <w:r>
-        <w:rPr>
-          <w:rFonts w:ascii="Segoe UI Emoji" w:hAnsi="Segoe UI Emoji" w:cs="Segoe UI Emoji"/>
-        </w:rPr>
-        <w:t>⚙️</w:t>
-      </w:r>
-      <w:r>
-        <w:t>`tb_agronomia.html` - Tabla principal de agronomía</w:t>
-      </w:r>
-    </w:p>
-    <w:p>
-      <w:r>
-        <w:t xml:space="preserve"> </w:t>
-      </w:r>
-      <w:r>
-        <w:rPr>
-          <w:rFonts w:ascii="Segoe UI Emoji" w:hAnsi="Segoe UI Emoji" w:cs="Segoe UI Emoji"/>
-        </w:rPr>
-        <w:t>⚙️</w:t>
-      </w:r>
-      <w:r>
-        <w:t xml:space="preserve"> </w:t>
-      </w:r>
-      <w:r>
-        <w:t>`f_cortes.html` - Programación de fechas de corte</w:t>
-      </w:r>
-    </w:p>
-    <w:p>
-      <w:r>
-        <w:rPr>
-          <w:rFonts w:ascii="Segoe UI Emoji" w:hAnsi="Segoe UI Emoji" w:cs="Segoe UI Emoji"/>
-        </w:rPr>
-        <w:t>⚙️</w:t>
-      </w:r>
-      <w:r>
-        <w:t xml:space="preserve"> </w:t>
-      </w:r>
-      <w:r>
-        <w:t>Más de 50 archivos PHP para diferentes operaciones agronómicas</w:t>
-      </w:r>
-    </w:p>
-    <w:p>
-      <w:r>
-        <w:rPr>
-          <w:rFonts w:ascii="Segoe UI Emoji" w:hAnsi="Segoe UI Emoji" w:cs="Segoe UI Emoji"/>
-        </w:rPr>
-        <w:t>⚙️</w:t>
-      </w:r>
-      <w:r>
-        <w:t xml:space="preserve"> </w:t>
-      </w:r>
-      <w:r>
-        <w:t>Scripts especializados para cada sub-proceso</w:t>
-      </w:r>
-    </w:p>
-    <w:p>
-      <w:r>
-        <w:rPr>
-          <w:rFonts w:ascii="Segoe UI Emoji" w:hAnsi="Segoe UI Emoji" w:cs="Segoe UI Emoji"/>
-        </w:rPr>
-        <w:t>⚙️</w:t>
-      </w:r>
-      <w:r>
-        <w:t xml:space="preserve"> </w:t>
-      </w:r>
-      <w:r>
-        <w:t>`gestion_permisos_agronomia.html` - Programación de permiso por roles para visualizar tablas</w:t>
-      </w:r>
-    </w:p>
-    <w:p>
-      <w:pPr>
-        <w:rPr>
-          <w:b/>
-          <w:bCs/>
-        </w:rPr>
-      </w:pPr>
-    </w:p>
-    <w:p>
-      <w:pPr>
-        <w:pStyle w:val="Prrafodelista"/>
-        <w:numPr>
-          <w:ilvl w:val="0"/>
-          <w:numId w:val="12"/>
-        </w:numPr>
-        <w:rPr>
-          <w:b/>
-          <w:bCs/>
-        </w:rPr>
-      </w:pPr>
-      <w:r>
-        <w:rPr>
-          <w:b/>
-          <w:bCs/>
-        </w:rPr>
-        <w:t>Sub-procesos Agronómicos:</w:t>
-      </w:r>
-    </w:p>
-    <w:p>
-      <w:r>
-        <w:t>1. **Monitoreo de Plagas**: Registro y seguimiento de incidencia de plagas</w:t>
-      </w:r>
-    </w:p>
-    <w:p>
-      <w:r>
-        <w:t>2. **Control Fitosanitario**: Gestión de aplicaciones y tratamientos</w:t>
-      </w:r>
-    </w:p>
-    <w:p>
-      <w:r>
-        <w:t>3. **Fertilización**: Control de aplicaciones orgánicas y químicas</w:t>
-      </w:r>
-    </w:p>
-    <w:p>
-      <w:r>
-        <w:t>4. **Cosecha**: Registro de RFF (Racimos de Fruta Fresca)</w:t>
-      </w:r>
-    </w:p>
-    <w:p>
-      <w:r>
-        <w:t>5. **Calidad**: Control de calidad de fruta</w:t>
-      </w:r>
-    </w:p>
-    <w:p>
-      <w:r>
-        <w:t>6. **Mantenimiento**: Gestión de labores de mantenimiento</w:t>
-      </w:r>
-    </w:p>
-    <w:p>
-      <w:r>
-        <w:t>7. **Trampas**: Monitoreo de trampas para control de plagas</w:t>
-      </w:r>
-    </w:p>
-    <w:p>
-      <w:r>
-        <w:t>8. **Nivel Freático**: Control de agua subterránea</w:t>
+      <w:r>
+        <w:t>Componentes de interfaz (HTML/JS):</w:t>
+      </w:r>
+    </w:p>
+    <w:p>
+      <w:r>
+        <w:t>- ⚙️ `tb_agronomia.html` - Vista principal con pestañas por subproceso y acceso a reportes.</w:t>
+      </w:r>
+    </w:p>
+    <w:p>
+      <w:r>
+        <w:t>- ⚙️ `f_cortes.html` - Programación y edición de fechas de corte.</w:t>
+      </w:r>
+    </w:p>
+    <w:p>
+      <w:r>
+        <w:t>- ⚙️ `gestion_permisos_agronomia.html` - Administración de visibilidad por rol y pestaña.</w:t>
+      </w:r>
+    </w:p>
+    <w:p>
+      <w:r>
+        <w:t>- ⚙️ Scripts especializados: `agronomia.js`, `role_guard_agronomia.js`, `role_permissions.js`, `notificaciones_operaciones.js` y formularios específicos (`plagas.js`, `fertilizacion_organica.js`, `cosecha_fruta.js`, `nivel_freatico.js`, `labores_diarias.js`, entre otros).</w:t>
       </w:r>
     </w:p>
     <w:p/>
     <w:p>
-      <w:pPr>
-        <w:pStyle w:val="Prrafodelista"/>
-        <w:numPr>
-          <w:ilvl w:val="0"/>
-          <w:numId w:val="12"/>
-        </w:numPr>
-        <w:rPr>
-          <w:b/>
-          <w:bCs/>
-        </w:rPr>
-      </w:pPr>
-      <w:r>
-        <w:rPr>
-          <w:b/>
-          <w:bCs/>
-        </w:rPr>
-        <w:t>Tablas Principales:</w:t>
-      </w:r>
-    </w:p>
-    <w:p>
-      <w:r>
-        <w:t>- `agr_fecha_corte` - Programación de cortes</w:t>
-      </w:r>
-    </w:p>
-    <w:p>
-      <w:r>
-        <w:t xml:space="preserve">   </w:t>
-      </w:r>
-      <w:r>
-        <w:t>`</w:t>
-      </w:r>
-      <w:r>
-        <w:t>gestión_permisos</w:t>
-      </w:r>
-      <w:r>
-        <w:t xml:space="preserve">` - Programación </w:t>
-      </w:r>
-      <w:r>
-        <w:t xml:space="preserve">permisos por roles </w:t>
-      </w:r>
-    </w:p>
-    <w:p>
-      <w:r>
-        <w:lastRenderedPageBreak/>
-        <w:t>- Múltiples tablas para diferentes aspectos agronómicos</w:t>
+      <w:r>
+        <w:t>Servicios y APIs (PHP):</w:t>
+      </w:r>
+    </w:p>
+    <w:p>
+      <w:r>
+        <w:t>- Endpoints por subproceso en `m_agronomia/assets/php/`: `plagas_api.php`, `cosecha_fruta_api.php`, `fertilizacion_organica_api.php`, `labores_diarias_api.php`, `monitoreos_generales_api.php`, `mantenimientos_api.php`, `monitoreo_trampas_api.php`, `nivel_freatico_api.php`, `polinizacion_api.php`, `oficios_varios_palma_api.php`, `coberturas_api.php`, `ct_cal_sanidad_api.php`, `ct_polinizacion_flores_api.php`.</w:t>
+      </w:r>
+    </w:p>
+    <w:p>
+      <w:r>
+        <w:t>- Control de auditoría y reportes: `aud_fertilizacion_api.php`, `aud_cosecha_api.php`, `aud_maquinaria_api.php`, `aud_perdidas_api.php`, `aud_vagones_api.php`, `reporte_lote_monitoreo_api.php`.</w:t>
+      </w:r>
+    </w:p>
+    <w:p>
+      <w:r>
+        <w:t>- Gestión de permisos y estructura: `manage_tab_permissions.php`, `roles_auth.php`, `add_new_tabs_to_db.php`, `migrate_tabs_to_db.php`, `create_new_tables_v2.php`.</w:t>
+      </w:r>
+    </w:p>
+    <w:p/>
+    <w:p>
+      <w:r>
+        <w:t>Tablas y datos clave:</w:t>
+      </w:r>
+    </w:p>
+    <w:p>
+      <w:r>
+        <w:t>- `agr_fecha_corte` para programación y sincronización con `f_cortes.html`.</w:t>
+      </w:r>
+    </w:p>
+    <w:p>
+      <w:r>
+        <w:t>- `agr_tab_permissions` para visibilidad por pestaña/rol.</w:t>
+      </w:r>
+    </w:p>
+    <w:p>
+      <w:r>
+        <w:t>- Tablas operativas por subproceso: `plagas`, `coberturas`, `fertilizacion_organica`, `compostaje`, `labores_diarias`, `mantenimientos`, `oficios_varios_palma`, `erradicaciones`, `siembra_nueva`, `resiembra`, `nivel_freatico`, `cosecha_fruta`, `reco_fruta`, `monitoreos_generales`, `monitoreo_trampas`, `polinizacion`, `ct_cal_sanidad`, `ct_cal_trampas`, `ct_cal_labores`.</w:t>
+      </w:r>
+    </w:p>
+    <w:p>
+      <w:r>
+        <w:t>- Tablas de auditoría y control: `aud_maquinaria`, `aud_cosecha`, `aud_fertilizacion`, `aud_perdidas`, `aud_vagones`.</w:t>
+      </w:r>
+    </w:p>
+    <w:p>
+      <w:r>
+        <w:t>- Vistas y registros de seguimiento: `pendientes_operaciones`, `eventos_pendientes_operaciones`, `reporte_lote_monitoreo`.</w:t>
+      </w:r>
+    </w:p>
+    <w:p/>
+    <w:p>
+      <w:r>
+        <w:t>Notas de calidad y seguridad:</w:t>
+      </w:r>
+    </w:p>
+    <w:p>
+      <w:r>
+        <w:t>- Validación de roles y CSRF en APIs clave; `role_guard_agronomia.js` protege las pestañas según permisos.</w:t>
+      </w:r>
+    </w:p>
+    <w:p>
+      <w:r>
+        <w:t>- Formularios con campos obligatorios, estados de supervisión (`pendiente`/`aprobado`) y bandera `error_registro` para trazabilidad.</w:t>
+      </w:r>
+    </w:p>
+    <w:p>
+      <w:r>
+        <w:t>- Notificaciones configurables para pendientes y vencimientos mediante `init_noti_admin.js` y `notificaciones_operaciones.js`.</w:t>
       </w:r>
     </w:p>
     <w:p>

</xml_diff>